<commit_message>
docs(itesca): confirmar semestre y actualizar cierre de Seminario I
Registrar el cierre documental de T11 sin declararla enviada; actualizar T3 y T4 a primer semestre y conservar sus PDF recompilados.

Incorporar bibliografia y delimitacion de Monterrey, notas de confirmacion y herramientas de actualizacion, distinguiendo fuentes conceptuales de evidencia regional y pendientes academicos.
</commit_message>
<xml_diff>
--- a/ITESCA/maestria-en-gestion-administrativa/seminario-i-mga/entregas/Tarea11_DeLaCruzMunoz.docx
+++ b/ITESCA/maestria-en-gestion-administrativa/seminario-i-mga/entregas/Tarea11_DeLaCruzMunoz.docx
@@ -3,6 +3,11 @@
 <w:document xmlns:wpc="http://schemas.microsoft.com/office/word/2010/wordprocessingCanvas" xmlns:cx="http://schemas.microsoft.com/office/drawing/2014/chartex" xmlns:cx1="http://schemas.microsoft.com/office/drawing/2015/9/8/chartex" xmlns:cx2="http://schemas.microsoft.com/office/drawing/2015/10/21/chartex" xmlns:cx3="http://schemas.microsoft.com/office/drawing/2016/5/9/chartex" xmlns:cx4="http://schemas.microsoft.com/office/drawing/2016/5/10/chartex" xmlns:cx5="http://schemas.microsoft.com/office/drawing/2016/5/11/chartex" xmlns:cx6="http://schemas.microsoft.com/office/drawing/2016/5/12/chartex" xmlns:cx7="http://schemas.microsoft.com/office/drawing/2016/5/13/chartex" xmlns:cx8="http://schemas.microsoft.com/office/drawing/2016/5/14/chartex" xmlns:mc="http://schemas.openxmlformats.org/markup-compatibility/2006" xmlns:aink="http://schemas.microsoft.com/office/drawing/2016/ink" xmlns:am3d="http://schemas.microsoft.com/office/drawing/2017/model3d" xmlns:o="urn:schemas-microsoft-com:office:office" xmlns:oel="http://schemas.microsoft.com/office/2019/extlst" xmlns:r="http://schemas.openxmlformats.org/officeDocument/2006/relationships" xmlns:m="http://schemas.openxmlformats.org/officeDocument/2006/math" xmlns:v="urn:schemas-microsoft-com:vml" xmlns:wp14="http://schemas.microsoft.com/office/word/2010/wordprocessingDrawing" xmlns:wp="http://schemas.openxmlformats.org/drawingml/2006/wordprocessingDrawing" xmlns:w10="urn:schemas-microsoft-com:office:word" xmlns:w="http://schemas.openxmlformats.org/wordprocessingml/2006/main" xmlns:w14="http://schemas.microsoft.com/office/word/2010/wordml" xmlns:w15="http://schemas.microsoft.com/office/word/2012/wordml" xmlns:w16cex="http://schemas.microsoft.com/office/word/2018/wordml/cex" xmlns:w16cid="http://schemas.microsoft.com/office/word/2016/wordml/cid" xmlns:w16="http://schemas.microsoft.com/office/word/2018/wordml" xmlns:w16sdtdh="http://schemas.microsoft.com/office/word/2020/wordml/sdtdatahash" xmlns:w16se="http://schemas.microsoft.com/office/word/2015/wordml/symex" xmlns:wpg="http://schemas.microsoft.com/office/word/2010/wordprocessingGroup" xmlns:wpi="http://schemas.microsoft.com/office/word/2010/wordprocessingInk" xmlns:wne="http://schemas.microsoft.com/office/word/2006/wordml" xmlns:wps="http://schemas.microsoft.com/office/word/2010/wordprocessingShape" mc:Ignorable="w14 w15 w16se w16cid w16 w16cex w16sdtdh wp14">
   <w:body>
     <w:p>
+      <w:r>
+        <w:t>Semestre: primero. Delimitación del estudio: Monterrey, Nuevo León.</w:t>
+      </w:r>
+    </w:p>
+    <w:p>
       <w:pPr>
         <w:pStyle w:val="APAportada"/>
         <w:keepNext/>
@@ -13,7 +18,7 @@
           <w:noProof/>
         </w:rPr>
         <w:drawing>
-          <wp:inline distT="0" distB="0" distL="0" distR="0" wp14:anchorId="1B2E6DE9" wp14:editId="5F3B4129">
+          <wp:inline distT="0" distB="0" distL="0" distR="0" wp14:anchorId="6E7FDCE2" wp14:editId="3A49CBF4">
             <wp:extent cx="5943600" cy="586740"/>
             <wp:effectExtent l="0" t="0" r="0" b="0"/>
             <wp:docPr id="1" name="Picture 1"/>
@@ -228,7 +233,7 @@
       <w:r>
         <w:fldChar w:fldCharType="separate"/>
       </w:r>
-      <w:hyperlink w:anchor="_Toc242548485" w:history="1">
+      <w:hyperlink w:anchor="_Toc242551004" w:history="1">
         <w:r>
           <w:rPr>
             <w:rStyle w:val="Hipervnculo"/>
@@ -255,7 +260,7 @@
             <w:noProof/>
             <w:webHidden/>
           </w:rPr>
-          <w:instrText xml:space="preserve"> PAGEREF _Toc242548485 \h </w:instrText>
+          <w:instrText xml:space="preserve"> PAGEREF _Toc242551004 \h </w:instrText>
         </w:r>
         <w:r>
           <w:rPr>
@@ -300,7 +305,7 @@
           <w14:ligatures w14:val="standardContextual"/>
         </w:rPr>
       </w:pPr>
-      <w:hyperlink w:anchor="_Toc242548486" w:history="1">
+      <w:hyperlink w:anchor="_Toc242551005" w:history="1">
         <w:r>
           <w:rPr>
             <w:rStyle w:val="Hipervnculo"/>
@@ -327,7 +332,7 @@
             <w:noProof/>
             <w:webHidden/>
           </w:rPr>
-          <w:instrText xml:space="preserve"> PAGEREF _Toc242548486 \h </w:instrText>
+          <w:instrText xml:space="preserve"> PAGEREF _Toc242551005 \h </w:instrText>
         </w:r>
         <w:r>
           <w:rPr>
@@ -372,7 +377,7 @@
           <w14:ligatures w14:val="standardContextual"/>
         </w:rPr>
       </w:pPr>
-      <w:hyperlink w:anchor="_Toc242548487" w:history="1">
+      <w:hyperlink w:anchor="_Toc242551006" w:history="1">
         <w:r>
           <w:rPr>
             <w:rStyle w:val="Hipervnculo"/>
@@ -399,7 +404,7 @@
             <w:noProof/>
             <w:webHidden/>
           </w:rPr>
-          <w:instrText xml:space="preserve"> PAGEREF _Toc242548487 \h </w:instrText>
+          <w:instrText xml:space="preserve"> PAGEREF _Toc242551006 \h </w:instrText>
         </w:r>
         <w:r>
           <w:rPr>
@@ -444,7 +449,7 @@
           <w14:ligatures w14:val="standardContextual"/>
         </w:rPr>
       </w:pPr>
-      <w:hyperlink w:anchor="_Toc242548488" w:history="1">
+      <w:hyperlink w:anchor="_Toc242551007" w:history="1">
         <w:r>
           <w:rPr>
             <w:rStyle w:val="Hipervnculo"/>
@@ -471,7 +476,7 @@
             <w:noProof/>
             <w:webHidden/>
           </w:rPr>
-          <w:instrText xml:space="preserve"> PAGEREF _Toc242548488 \h </w:instrText>
+          <w:instrText xml:space="preserve"> PAGEREF _Toc242551007 \h </w:instrText>
         </w:r>
         <w:r>
           <w:rPr>
@@ -516,7 +521,7 @@
           <w14:ligatures w14:val="standardContextual"/>
         </w:rPr>
       </w:pPr>
-      <w:hyperlink w:anchor="_Toc242548489" w:history="1">
+      <w:hyperlink w:anchor="_Toc242551008" w:history="1">
         <w:r>
           <w:rPr>
             <w:rStyle w:val="Hipervnculo"/>
@@ -543,7 +548,7 @@
             <w:noProof/>
             <w:webHidden/>
           </w:rPr>
-          <w:instrText xml:space="preserve"> PAGEREF _Toc242548489 \h </w:instrText>
+          <w:instrText xml:space="preserve"> PAGEREF _Toc242551008 \h </w:instrText>
         </w:r>
         <w:r>
           <w:rPr>
@@ -588,7 +593,7 @@
           <w14:ligatures w14:val="standardContextual"/>
         </w:rPr>
       </w:pPr>
-      <w:hyperlink w:anchor="_Toc242548490" w:history="1">
+      <w:hyperlink w:anchor="_Toc242551009" w:history="1">
         <w:r>
           <w:rPr>
             <w:rStyle w:val="Hipervnculo"/>
@@ -615,7 +620,7 @@
             <w:noProof/>
             <w:webHidden/>
           </w:rPr>
-          <w:instrText xml:space="preserve"> PAGEREF _Toc242548490 \h </w:instrText>
+          <w:instrText xml:space="preserve"> PAGEREF _Toc242551009 \h </w:instrText>
         </w:r>
         <w:r>
           <w:rPr>
@@ -660,7 +665,7 @@
           <w14:ligatures w14:val="standardContextual"/>
         </w:rPr>
       </w:pPr>
-      <w:hyperlink w:anchor="_Toc242548491" w:history="1">
+      <w:hyperlink w:anchor="_Toc242551010" w:history="1">
         <w:r>
           <w:rPr>
             <w:rStyle w:val="Hipervnculo"/>
@@ -687,7 +692,7 @@
             <w:noProof/>
             <w:webHidden/>
           </w:rPr>
-          <w:instrText xml:space="preserve"> PAGEREF _Toc242548491 \h </w:instrText>
+          <w:instrText xml:space="preserve"> PAGEREF _Toc242551010 \h </w:instrText>
         </w:r>
         <w:r>
           <w:rPr>
@@ -732,7 +737,7 @@
           <w14:ligatures w14:val="standardContextual"/>
         </w:rPr>
       </w:pPr>
-      <w:hyperlink w:anchor="_Toc242548492" w:history="1">
+      <w:hyperlink w:anchor="_Toc242551011" w:history="1">
         <w:r>
           <w:rPr>
             <w:rStyle w:val="Hipervnculo"/>
@@ -759,7 +764,7 @@
             <w:noProof/>
             <w:webHidden/>
           </w:rPr>
-          <w:instrText xml:space="preserve"> PAGEREF _Toc242548492 \h </w:instrText>
+          <w:instrText xml:space="preserve"> PAGEREF _Toc242551011 \h </w:instrText>
         </w:r>
         <w:r>
           <w:rPr>
@@ -804,7 +809,7 @@
           <w14:ligatures w14:val="standardContextual"/>
         </w:rPr>
       </w:pPr>
-      <w:hyperlink w:anchor="_Toc242548493" w:history="1">
+      <w:hyperlink w:anchor="_Toc242551012" w:history="1">
         <w:r>
           <w:rPr>
             <w:rStyle w:val="Hipervnculo"/>
@@ -831,7 +836,7 @@
             <w:noProof/>
             <w:webHidden/>
           </w:rPr>
-          <w:instrText xml:space="preserve"> PAGEREF _Toc242548493 \h </w:instrText>
+          <w:instrText xml:space="preserve"> PAGEREF _Toc242551012 \h </w:instrText>
         </w:r>
         <w:r>
           <w:rPr>
@@ -876,7 +881,7 @@
           <w14:ligatures w14:val="standardContextual"/>
         </w:rPr>
       </w:pPr>
-      <w:hyperlink w:anchor="_Toc242548494" w:history="1">
+      <w:hyperlink w:anchor="_Toc242551013" w:history="1">
         <w:r>
           <w:rPr>
             <w:rStyle w:val="Hipervnculo"/>
@@ -903,7 +908,7 @@
             <w:noProof/>
             <w:webHidden/>
           </w:rPr>
-          <w:instrText xml:space="preserve"> PAGEREF _Toc242548494 \h </w:instrText>
+          <w:instrText xml:space="preserve"> PAGEREF _Toc242551013 \h </w:instrText>
         </w:r>
         <w:r>
           <w:rPr>
@@ -948,7 +953,7 @@
           <w14:ligatures w14:val="standardContextual"/>
         </w:rPr>
       </w:pPr>
-      <w:hyperlink w:anchor="_Toc242548495" w:history="1">
+      <w:hyperlink w:anchor="_Toc242551014" w:history="1">
         <w:r>
           <w:rPr>
             <w:rStyle w:val="Hipervnculo"/>
@@ -975,7 +980,7 @@
             <w:noProof/>
             <w:webHidden/>
           </w:rPr>
-          <w:instrText xml:space="preserve"> PAGEREF _Toc242548495 \h </w:instrText>
+          <w:instrText xml:space="preserve"> PAGEREF _Toc242551014 \h </w:instrText>
         </w:r>
         <w:r>
           <w:rPr>
@@ -1020,7 +1025,7 @@
           <w14:ligatures w14:val="standardContextual"/>
         </w:rPr>
       </w:pPr>
-      <w:hyperlink w:anchor="_Toc242548496" w:history="1">
+      <w:hyperlink w:anchor="_Toc242551015" w:history="1">
         <w:r>
           <w:rPr>
             <w:rStyle w:val="Hipervnculo"/>
@@ -1047,7 +1052,7 @@
             <w:noProof/>
             <w:webHidden/>
           </w:rPr>
-          <w:instrText xml:space="preserve"> PAGEREF _Toc242548496 \h </w:instrText>
+          <w:instrText xml:space="preserve"> PAGEREF _Toc242551015 \h </w:instrText>
         </w:r>
         <w:r>
           <w:rPr>
@@ -1092,7 +1097,7 @@
           <w14:ligatures w14:val="standardContextual"/>
         </w:rPr>
       </w:pPr>
-      <w:hyperlink w:anchor="_Toc242548497" w:history="1">
+      <w:hyperlink w:anchor="_Toc242551016" w:history="1">
         <w:r>
           <w:rPr>
             <w:rStyle w:val="Hipervnculo"/>
@@ -1119,7 +1124,7 @@
             <w:noProof/>
             <w:webHidden/>
           </w:rPr>
-          <w:instrText xml:space="preserve"> PAGEREF _Toc242548497 \h </w:instrText>
+          <w:instrText xml:space="preserve"> PAGEREF _Toc242551016 \h </w:instrText>
         </w:r>
         <w:r>
           <w:rPr>
@@ -1164,7 +1169,7 @@
           <w14:ligatures w14:val="standardContextual"/>
         </w:rPr>
       </w:pPr>
-      <w:hyperlink w:anchor="_Toc242548498" w:history="1">
+      <w:hyperlink w:anchor="_Toc242551017" w:history="1">
         <w:r>
           <w:rPr>
             <w:rStyle w:val="Hipervnculo"/>
@@ -1191,7 +1196,7 @@
             <w:noProof/>
             <w:webHidden/>
           </w:rPr>
-          <w:instrText xml:space="preserve"> PAGEREF _Toc242548498 \h </w:instrText>
+          <w:instrText xml:space="preserve"> PAGEREF _Toc242551017 \h </w:instrText>
         </w:r>
         <w:r>
           <w:rPr>
@@ -1236,7 +1241,7 @@
           <w14:ligatures w14:val="standardContextual"/>
         </w:rPr>
       </w:pPr>
-      <w:hyperlink w:anchor="_Toc242548499" w:history="1">
+      <w:hyperlink w:anchor="_Toc242551018" w:history="1">
         <w:r>
           <w:rPr>
             <w:rStyle w:val="Hipervnculo"/>
@@ -1263,7 +1268,7 @@
             <w:noProof/>
             <w:webHidden/>
           </w:rPr>
-          <w:instrText xml:space="preserve"> PAGEREF _Toc242548499 \h </w:instrText>
+          <w:instrText xml:space="preserve"> PAGEREF _Toc242551018 \h </w:instrText>
         </w:r>
         <w:r>
           <w:rPr>
@@ -1308,7 +1313,7 @@
           <w14:ligatures w14:val="standardContextual"/>
         </w:rPr>
       </w:pPr>
-      <w:hyperlink w:anchor="_Toc242548500" w:history="1">
+      <w:hyperlink w:anchor="_Toc242551019" w:history="1">
         <w:r>
           <w:rPr>
             <w:rStyle w:val="Hipervnculo"/>
@@ -1335,7 +1340,7 @@
             <w:noProof/>
             <w:webHidden/>
           </w:rPr>
-          <w:instrText xml:space="preserve"> PAGEREF _Toc242548500 \h </w:instrText>
+          <w:instrText xml:space="preserve"> PAGEREF _Toc242551019 \h </w:instrText>
         </w:r>
         <w:r>
           <w:rPr>
@@ -1380,7 +1385,7 @@
           <w14:ligatures w14:val="standardContextual"/>
         </w:rPr>
       </w:pPr>
-      <w:hyperlink w:anchor="_Toc242548501" w:history="1">
+      <w:hyperlink w:anchor="_Toc242551020" w:history="1">
         <w:r>
           <w:rPr>
             <w:rStyle w:val="Hipervnculo"/>
@@ -1407,7 +1412,7 @@
             <w:noProof/>
             <w:webHidden/>
           </w:rPr>
-          <w:instrText xml:space="preserve"> PAGEREF _Toc242548501 \h </w:instrText>
+          <w:instrText xml:space="preserve"> PAGEREF _Toc242551020 \h </w:instrText>
         </w:r>
         <w:r>
           <w:rPr>
@@ -1452,7 +1457,7 @@
           <w14:ligatures w14:val="standardContextual"/>
         </w:rPr>
       </w:pPr>
-      <w:hyperlink w:anchor="_Toc242548502" w:history="1">
+      <w:hyperlink w:anchor="_Toc242551021" w:history="1">
         <w:r>
           <w:rPr>
             <w:rStyle w:val="Hipervnculo"/>
@@ -1479,7 +1484,7 @@
             <w:noProof/>
             <w:webHidden/>
           </w:rPr>
-          <w:instrText xml:space="preserve"> PAGEREF _Toc242548502 \h </w:instrText>
+          <w:instrText xml:space="preserve"> PAGEREF _Toc242551021 \h </w:instrText>
         </w:r>
         <w:r>
           <w:rPr>
@@ -1524,7 +1529,7 @@
           <w14:ligatures w14:val="standardContextual"/>
         </w:rPr>
       </w:pPr>
-      <w:hyperlink w:anchor="_Toc242548503" w:history="1">
+      <w:hyperlink w:anchor="_Toc242551022" w:history="1">
         <w:r>
           <w:rPr>
             <w:rStyle w:val="Hipervnculo"/>
@@ -1551,7 +1556,7 @@
             <w:noProof/>
             <w:webHidden/>
           </w:rPr>
-          <w:instrText xml:space="preserve"> PAGEREF _Toc242548503 \h </w:instrText>
+          <w:instrText xml:space="preserve"> PAGEREF _Toc242551022 \h </w:instrText>
         </w:r>
         <w:r>
           <w:rPr>
@@ -1596,7 +1601,7 @@
           <w14:ligatures w14:val="standardContextual"/>
         </w:rPr>
       </w:pPr>
-      <w:hyperlink w:anchor="_Toc242548504" w:history="1">
+      <w:hyperlink w:anchor="_Toc242551023" w:history="1">
         <w:r>
           <w:rPr>
             <w:rStyle w:val="Hipervnculo"/>
@@ -1623,7 +1628,7 @@
             <w:noProof/>
             <w:webHidden/>
           </w:rPr>
-          <w:instrText xml:space="preserve"> PAGEREF _Toc242548504 \h </w:instrText>
+          <w:instrText xml:space="preserve"> PAGEREF _Toc242551023 \h </w:instrText>
         </w:r>
         <w:r>
           <w:rPr>
@@ -1668,7 +1673,7 @@
           <w14:ligatures w14:val="standardContextual"/>
         </w:rPr>
       </w:pPr>
-      <w:hyperlink w:anchor="_Toc242548505" w:history="1">
+      <w:hyperlink w:anchor="_Toc242551024" w:history="1">
         <w:r>
           <w:rPr>
             <w:rStyle w:val="Hipervnculo"/>
@@ -1695,7 +1700,7 @@
             <w:noProof/>
             <w:webHidden/>
           </w:rPr>
-          <w:instrText xml:space="preserve"> PAGEREF _Toc242548505 \h </w:instrText>
+          <w:instrText xml:space="preserve"> PAGEREF _Toc242551024 \h </w:instrText>
         </w:r>
         <w:r>
           <w:rPr>
@@ -1740,7 +1745,7 @@
           <w14:ligatures w14:val="standardContextual"/>
         </w:rPr>
       </w:pPr>
-      <w:hyperlink w:anchor="_Toc242548506" w:history="1">
+      <w:hyperlink w:anchor="_Toc242551025" w:history="1">
         <w:r>
           <w:rPr>
             <w:rStyle w:val="Hipervnculo"/>
@@ -1767,7 +1772,7 @@
             <w:noProof/>
             <w:webHidden/>
           </w:rPr>
-          <w:instrText xml:space="preserve"> PAGEREF _Toc242548506 \h </w:instrText>
+          <w:instrText xml:space="preserve"> PAGEREF _Toc242551025 \h </w:instrText>
         </w:r>
         <w:r>
           <w:rPr>
@@ -1812,7 +1817,7 @@
           <w14:ligatures w14:val="standardContextual"/>
         </w:rPr>
       </w:pPr>
-      <w:hyperlink w:anchor="_Toc242548507" w:history="1">
+      <w:hyperlink w:anchor="_Toc242551026" w:history="1">
         <w:r>
           <w:rPr>
             <w:rStyle w:val="Hipervnculo"/>
@@ -1839,7 +1844,7 @@
             <w:noProof/>
             <w:webHidden/>
           </w:rPr>
-          <w:instrText xml:space="preserve"> PAGEREF _Toc242548507 \h </w:instrText>
+          <w:instrText xml:space="preserve"> PAGEREF _Toc242551026 \h </w:instrText>
         </w:r>
         <w:r>
           <w:rPr>
@@ -1884,7 +1889,7 @@
           <w14:ligatures w14:val="standardContextual"/>
         </w:rPr>
       </w:pPr>
-      <w:hyperlink w:anchor="_Toc242548508" w:history="1">
+      <w:hyperlink w:anchor="_Toc242551027" w:history="1">
         <w:r>
           <w:rPr>
             <w:rStyle w:val="Hipervnculo"/>
@@ -1911,7 +1916,7 @@
             <w:noProof/>
             <w:webHidden/>
           </w:rPr>
-          <w:instrText xml:space="preserve"> PAGEREF _Toc242548508 \h </w:instrText>
+          <w:instrText xml:space="preserve"> PAGEREF _Toc242551027 \h </w:instrText>
         </w:r>
         <w:r>
           <w:rPr>
@@ -1956,7 +1961,7 @@
           <w14:ligatures w14:val="standardContextual"/>
         </w:rPr>
       </w:pPr>
-      <w:hyperlink w:anchor="_Toc242548509" w:history="1">
+      <w:hyperlink w:anchor="_Toc242551028" w:history="1">
         <w:r>
           <w:rPr>
             <w:rStyle w:val="Hipervnculo"/>
@@ -1983,7 +1988,7 @@
             <w:noProof/>
             <w:webHidden/>
           </w:rPr>
-          <w:instrText xml:space="preserve"> PAGEREF _Toc242548509 \h </w:instrText>
+          <w:instrText xml:space="preserve"> PAGEREF _Toc242551028 \h </w:instrText>
         </w:r>
         <w:r>
           <w:rPr>
@@ -2028,7 +2033,7 @@
         <w:pageBreakBefore/>
         <w:spacing w:before="120" w:after="80"/>
       </w:pPr>
-      <w:bookmarkStart w:id="0" w:name="_Toc242548485"/>
+      <w:bookmarkStart w:id="0" w:name="_Toc242551004"/>
       <w:r>
         <w:lastRenderedPageBreak/>
         <w:t>1 Antecedentes</w:t>
@@ -2196,7 +2201,7 @@
         <w:pageBreakBefore/>
         <w:spacing w:before="120" w:after="80"/>
       </w:pPr>
-      <w:bookmarkStart w:id="1" w:name="_Toc242548486"/>
+      <w:bookmarkStart w:id="1" w:name="_Toc242551005"/>
       <w:r>
         <w:lastRenderedPageBreak/>
         <w:t>2 Planteamiento del problema</w:t>
@@ -2213,7 +2218,7 @@
         <w:pStyle w:val="Ttulo2"/>
         <w:spacing w:before="240" w:after="80"/>
       </w:pPr>
-      <w:bookmarkStart w:id="2" w:name="_Toc242548487"/>
+      <w:bookmarkStart w:id="2" w:name="_Toc242551006"/>
       <w:r>
         <w:t>2.1 Enunciado del problema</w:t>
       </w:r>
@@ -2272,7 +2277,7 @@
         <w:pStyle w:val="Ttulo2"/>
         <w:spacing w:before="240" w:after="80"/>
       </w:pPr>
-      <w:bookmarkStart w:id="3" w:name="_Toc242548488"/>
+      <w:bookmarkStart w:id="3" w:name="_Toc242551007"/>
       <w:r>
         <w:t>2.2 Formulación del problema</w:t>
       </w:r>
@@ -2298,7 +2303,7 @@
         <w:pStyle w:val="Ttulo2"/>
         <w:spacing w:before="240" w:after="80"/>
       </w:pPr>
-      <w:bookmarkStart w:id="4" w:name="_Toc242548489"/>
+      <w:bookmarkStart w:id="4" w:name="_Toc242551008"/>
       <w:r>
         <w:lastRenderedPageBreak/>
         <w:t>2.3 Preguntas específicas</w:t>
@@ -2342,7 +2347,7 @@
         <w:pStyle w:val="Ttulo1"/>
         <w:spacing w:before="120" w:after="80"/>
       </w:pPr>
-      <w:bookmarkStart w:id="5" w:name="_Toc242548490"/>
+      <w:bookmarkStart w:id="5" w:name="_Toc242551009"/>
       <w:r>
         <w:t>3 Formulación de objetivos general y específicos</w:t>
       </w:r>
@@ -2364,7 +2369,7 @@
         <w:pStyle w:val="Ttulo2"/>
         <w:spacing w:before="120" w:after="80"/>
       </w:pPr>
-      <w:bookmarkStart w:id="6" w:name="_Toc242548491"/>
+      <w:bookmarkStart w:id="6" w:name="_Toc242551010"/>
       <w:r>
         <w:lastRenderedPageBreak/>
         <w:t>3.1 Objetivo general</w:t>
@@ -2384,7 +2389,7 @@
         <w:pStyle w:val="Ttulo2"/>
         <w:spacing w:before="120" w:after="80"/>
       </w:pPr>
-      <w:bookmarkStart w:id="7" w:name="_Toc242548492"/>
+      <w:bookmarkStart w:id="7" w:name="_Toc242551011"/>
       <w:r>
         <w:t>3.2 Objetivos específicos</w:t>
       </w:r>
@@ -2447,7 +2452,7 @@
         <w:pStyle w:val="Ttulo1"/>
         <w:spacing w:before="120" w:after="80"/>
       </w:pPr>
-      <w:bookmarkStart w:id="8" w:name="_Toc242548493"/>
+      <w:bookmarkStart w:id="8" w:name="_Toc242551012"/>
       <w:r>
         <w:t>4 Justificación</w:t>
       </w:r>
@@ -2457,7 +2462,7 @@
       <w:pPr>
         <w:pStyle w:val="Ttulo2"/>
       </w:pPr>
-      <w:bookmarkStart w:id="9" w:name="_Toc242548494"/>
+      <w:bookmarkStart w:id="9" w:name="_Toc242551013"/>
       <w:r>
         <w:t>4.1 Relevancia teórica</w:t>
       </w:r>
@@ -2465,29 +2470,20 @@
     </w:p>
     <w:p>
       <w:r>
-        <w:t>La transformación digital de una organización no se reduce a incorporar una aplicación: requiere relacionar los recursos tecnológicos con decisiones, responsabilidades y procesos. Kraus et al. (2021) ofrecen un panorama de ese campo, mientras que los antecedentes del corpus de MiPyMEs muestran la necesidad de delimitar el contexto antes de trasladar sus resultados. En este estudio, el interés teórico consiste en examinar cómo se relaciona la gestión del cumplimiento normativo con la preparación administrati</w:t>
-      </w:r>
-      <w:r>
-        <w:t>va de un expediente; no en demostrar que la digitalización produzca automáticamente formalización o competitividad.</w:t>
+        <w:t>La transformación digital de una organización no se reduce a incorporar una aplicación: requiere relacionar los recursos tecnológicos con decisiones, responsabilidades y procesos. Kraus et al. (2021) ofrecen un panorama de ese campo, mientras que los antecedentes del corpus de MiPyMEs muestran la necesidad de delimitar el contexto antes de trasladar sus resultados. En este estudio, el interés teórico consiste en examinar cómo se relaciona la gestión del cumplimiento normativo con la preparación administrativa de un expediente; no en demostrar que la digitalización produzca automáticamente formalización o competitividad.</w:t>
       </w:r>
     </w:p>
     <w:p>
       <w:r>
         <w:lastRenderedPageBreak/>
-        <w:t xml:space="preserve">El objetivo general de Tarea 10 concreta esa relación en vTaxi, como </w:t>
-      </w:r>
-      <w:r>
-        <w:t>proyecto de plataforma de taxis concesionados en Nuevo León, durante septiembre a noviembre de 2026. Sus categorías analíticas son la asignación de responsables, la verificación de requisitos y el seguimiento documental, contrastadas con la integridad del expediente y la atención de observaciones internas. La contribución esperada es una lectura trazable del caso que permita distinguir requisitos identificados, evidencias disponibles y controles propuestos. No se plantea validar un modelo causal ni generali</w:t>
-      </w:r>
-      <w:r>
-        <w:t>zar resultados de un solo proyecto a todo el sector.</w:t>
+        <w:t>El objetivo general de Tarea 10 concreta esa relación en vTaxi, como proyecto de plataforma de taxis concesionados en Nuevo León, durante septiembre a noviembre de 2026. Sus categorías analíticas son la asignación de responsables, la verificación de requisitos y el seguimiento documental, contrastadas con la integridad del expediente y la atención de observaciones internas. La contribución esperada es una lectura trazable del caso que permita distinguir requisitos identificados, evidencias disponibles y controles propuestos. No se plantea validar un modelo causal ni generalizar resultados de un solo proyecto a todo el sector.</w:t>
       </w:r>
     </w:p>
     <w:p>
       <w:pPr>
         <w:pStyle w:val="Ttulo2"/>
       </w:pPr>
-      <w:bookmarkStart w:id="10" w:name="_Toc242548495"/>
+      <w:bookmarkStart w:id="10" w:name="_Toc242551014"/>
       <w:r>
         <w:t>4.2 Relevancia práctica</w:t>
       </w:r>
@@ -2495,113 +2491,94 @@
     </w:p>
     <w:p>
       <w:r>
-        <w:t>El problema formulado en Tarea 9 es una brecha de preparación documental, no una declaración de incumplimiento comprobado de la empresa. La utilidad práctica del estudio reside en convertir esa brecha en decisiones verificables: qué requisito corresponde al modelo del proyecto, qué evidencia lo respalda, quién debe revisarla y qué observación permanece abierta. Esta orientación responde a la LGAC Gestión e Innovación de las Organizaciones, porque concentra el análisis en procedimientos, responsables, docume</w:t>
-      </w:r>
-      <w:r>
-        <w:t>ntos, controles e indicadores y no en un dictamen predominantemente jurídico.</w:t>
-      </w:r>
-    </w:p>
-    <w:p>
-      <w:r>
-        <w:t xml:space="preserve">Los objetivos específicos definen cuatro productos coherentes con esa utilidad: un catálogo de requisitos por modalidad y autoridad; un diagnóstico de brechas; una matriz de contraste entre controles y estado del expediente; y una ruta priorizada de atención. Un escenario de aplicación sería detectar que una afirmación de un borrador carece de fuente o documento de respaldo y asignar su comprobación antes de usarla en una solicitud. Otro sería separar la capacitación de conductores de la autorización de la </w:t>
-      </w:r>
-      <w:r>
-        <w:t>plataforma. Los indicadores propuestos —cobertura de responsabilidades y cierre documentado de observaciones— se calcularían con denominadores y criterios explícitos; no se presentan valores obtenidos ni ahorros financieros demostrados.</w:t>
+        <w:t>El problema formulado en Tarea 9 es una brecha de preparación documental, no una declaración de incumplimiento comprobado de la empresa. La utilidad práctica del estudio reside en convertir esa brecha en decisiones verificables: qué requisito corresponde al modelo del proyecto, qué evidencia lo respalda, quién debe revisarla y qué observación permanece abierta. Esta orientación responde a la LGAC Gestión e Innovación de las Organizaciones, porque concentra el análisis en procedimientos, responsables, documentos, controles e indicadores y no en un dictamen predominantemente jurídico.</w:t>
+      </w:r>
+    </w:p>
+    <w:p>
+      <w:r>
+        <w:t>Los objetivos específicos definen cuatro productos coherentes con esa utilidad: un catálogo de requisitos por modalidad y autoridad; un diagnóstico de brechas; una matriz de contraste entre controles y estado del expediente; y una ruta priorizada de atención. Un escenario de aplicación sería detectar que una afirmación de un borrador carece de fuente o documento de respaldo y asignar su comprobación antes de usarla en una solicitud. Otro sería separar la capacitación de conductores de la autorización de la plataforma. Los indicadores propuestos —cobertura de responsabilidades y cierre documentado de observaciones— se calcularían con denominadores y criterios explícitos; no se presentan valores obtenidos ni ahorros financieros demostrados.</w:t>
+      </w:r>
+    </w:p>
+    <w:p>
+      <w:r>
+        <w:t xml:space="preserve">La delimitación actual del caso es Monterrey, Nuevo León, por indicación del estudiante. El municipio no se equipara automáticamente con el área metropolitana ni con toda la entidad. </w:t>
+      </w:r>
+      <w:r>
+        <w:lastRenderedPageBreak/>
+        <w:t>Los Censos Económicos 2024 y el Censo de Población y Vivienda 2020 del INEGI constituyen fuentes para contextualizar establecimientos y población, pero los datos agregados del portal no se presentan como cifras municipales ni como demanda validada de vTaxi. La ley de movilidad de Nuevo León corresponde al ámbito normativo estatal. Los antecedentes de Cajeme se conservan como referencias históricas, no como evidencia empírica del caso de Monterrey.</w:t>
       </w:r>
     </w:p>
     <w:p>
       <w:pPr>
         <w:pStyle w:val="Ttulo2"/>
       </w:pPr>
-      <w:bookmarkStart w:id="11" w:name="_Toc242548496"/>
+      <w:bookmarkStart w:id="11" w:name="_Toc242551015"/>
+      <w:r>
+        <w:t>4.3 Relevancia social e institucional</w:t>
+      </w:r>
+      <w:bookmarkEnd w:id="11"/>
+    </w:p>
+    <w:p>
+      <w:r>
+        <w:t>Los beneficiarios directos potenciales son las personas responsables de la preparación y revisión administrativa del proyecto vTaxi. Una documentación ordenada podría facilitar la coordinación y evitar que propuestas internas se comuniquen como permisos o requisitos oficiales. Los conductores vinculados al proyecto serían beneficiarios indirectos potenciales de información más clara sobre funciones y documentación, pero el estudio no acredita su participación, la existencia de concesiones de vTaxi ni una autorización operativa.</w:t>
+      </w:r>
+    </w:p>
+    <w:p>
+      <w:r>
+        <w:t>En el ámbito institucional, el caso permite aplicar competencias de la MGA: delimitar un problema organizacional, construir criterios de análisis, identificar evidencia y argumentar decisiones responsables. La distinción entre taxis concesionados y transporte privado mediante empresas de redes de transporte debe sostenerse en fuentes aplicables, como la ley estatal consultada, y no en analogías automáticas (H. Congreso del Estado de Nuevo León, 2026). El impacto se limita a la calidad de la preparación administrativa evaluable; no se promete seguridad vial, empleo, aprobación gubernamental o beneficio comunitario que el diseño documental no puede demostrar.</w:t>
+      </w:r>
+    </w:p>
+    <w:p>
+      <w:pPr>
+        <w:pStyle w:val="Ttulo2"/>
+      </w:pPr>
+      <w:bookmarkStart w:id="12" w:name="_Toc242551016"/>
+      <w:r>
+        <w:t>4.4 Originalidad</w:t>
+      </w:r>
+      <w:bookmarkEnd w:id="12"/>
+    </w:p>
+    <w:p>
+      <w:r>
+        <w:t xml:space="preserve">La originalidad propuesta es contextual y operativa: integrar la clasificación de requisitos por modalidad, el examen de borradores y la trazabilidad de responsabilidades en un mismo diagnóstico de preparación administrativa. Los diez antecedentes científicos de Tarea 3 proporcionan referencias sobre transformación digital e innovación en MiPyMEs; no se </w:t>
+      </w:r>
       <w:r>
         <w:lastRenderedPageBreak/>
-        <w:t>4.3 Relevancia social e institucional</w:t>
-      </w:r>
-      <w:bookmarkEnd w:id="11"/>
-    </w:p>
-    <w:p>
-      <w:r>
-        <w:t>Los beneficiarios directos potenciales son las personas responsables de la preparación y revisión administrativa del proyecto vTaxi. Una documentación ordenada podría facilitar la coordinación y evitar que propuestas internas se comuniquen como permisos o requisitos oficiales. Los conductores vinculados al proyecto serían beneficiarios indirectos potenciales de información más clara sobre funciones y documentación, pero el estudio no acredita su participación, la existencia de concesiones de vTaxi ni una au</w:t>
-      </w:r>
-      <w:r>
-        <w:t>torización operativa.</w:t>
-      </w:r>
-    </w:p>
-    <w:p>
-      <w:r>
-        <w:t>En el ámbito institucional, el caso permite aplicar competencias de la MGA: delimitar un problema organizacional, construir criterios de análisis, identificar evidencia y argumentar decisiones responsables. La distinción entre taxis concesionados y transporte privado mediante empresas de redes de transporte debe sostenerse en fuentes aplicables, como la ley estatal consultada, y no en analogías automáticas (H. Congreso del Estado de Nuevo León, 2026). El impacto se limita a la calidad de la preparación admi</w:t>
-      </w:r>
-      <w:r>
-        <w:t>nistrativa evaluable; no se promete seguridad vial, empleo, aprobación gubernamental o beneficio comunitario que el diseño documental no puede demostrar.</w:t>
+        <w:t>sustituyen por nuevos estudios ni se asume que investiguen exactamente plataformas de taxis en Nuevo León. Parker y Nielsen (2009) aportan un antecedente conceptual sobre cumplimiento empresarial, utilizado con el alcance de resumen editorial documentado en la revisión previa, no como evidencia empírica local.</w:t>
+      </w:r>
+    </w:p>
+    <w:p>
+      <w:r>
+        <w:t>El valor agregado esperado frente a una simple recopilación normativa es vincular cada afirmación del expediente con su fuente, responsable propuesto, evidencia y condición de cierre. El vacío atendido es la falta de esa articulación en los componentes disponibles del caso, según el problema delimitado; no se sostiene que sea el primer estudio del tema ni que exista una ausencia universal de investigación. La novedad deberá evaluarse frente a la evidencia reunida y a la ampliación bibliográfica regional, que sigue pendiente.</w:t>
       </w:r>
     </w:p>
     <w:p>
       <w:pPr>
         <w:pStyle w:val="Ttulo2"/>
       </w:pPr>
-      <w:bookmarkStart w:id="12" w:name="_Toc242548497"/>
-      <w:r>
-        <w:t>4.4 Originalidad</w:t>
-      </w:r>
-      <w:bookmarkEnd w:id="12"/>
-    </w:p>
-    <w:p>
-      <w:r>
-        <w:t xml:space="preserve">La originalidad propuesta es contextual y operativa: integrar la clasificación de requisitos por modalidad, el examen de borradores y la </w:t>
-      </w:r>
-      <w:r>
-        <w:t>trazabilidad de responsabilidades en un mismo diagnóstico de preparación administrativa. Los diez antecedentes científicos de Tarea 3 proporcionan referencias sobre transformación digital e innovación en MiPyMEs; no se sustituyen por nuevos estudios ni se asume que investiguen exactamente plataformas de taxis en Nuevo León. Parker y Nielsen (2009) aportan un antecedente conceptual sobre cumplimiento empresarial, utilizado con el alcance de resumen editorial documentado en la revisión previa, no como evidenc</w:t>
-      </w:r>
-      <w:r>
-        <w:t>ia empírica local.</w:t>
-      </w:r>
-    </w:p>
-    <w:p>
-      <w:r>
-        <w:t xml:space="preserve">El valor agregado esperado frente a una simple recopilación normativa es vincular cada afirmación del expediente con su fuente, responsable propuesto, evidencia y condición de </w:t>
+      <w:bookmarkStart w:id="13" w:name="_Toc242551017"/>
+      <w:r>
+        <w:t>4.5 Viabilidad</w:t>
+      </w:r>
+      <w:bookmarkEnd w:id="13"/>
+    </w:p>
+    <w:p>
+      <w:r>
+        <w:t>La fase documental es realizable con los recursos locales comprobados: los antecedentes de Tareas 8–10, las matrices, las copias de borradores y los textos institucionales conservados. El material docente señala que la justificación debe argumentar tiempo, recursos, acceso, ética y limitaciones, no limitarse a afirmar que el tema es importante (Instituto Tecnológico Superior de Cajeme, s. f.-c). Para el periodo septiembre–noviembre de 2026 se propone utilizar lo ya recopilado en septiembre como línea de base y distribuir el trabajo restante en revisión de requisitos durante octubre, diagnóstico y contraste documental entre finales de octubre e inicios de noviembre, y priorización y revisión de resultados durante noviembre. Es una programación propuesta, no un registro de tareas ya realizadas.</w:t>
+      </w:r>
+    </w:p>
+    <w:p>
+      <w:r>
+        <w:t xml:space="preserve">La disponibilidad de las copias internas permite revisar su contenido, pero no demuestra autorización para entrevistar actores, acceder a expedientes completos o divulgar datos privados. Cualquier entrevista o incorporación de nuevos documentos quedará condicionada al consentimiento, autorización y disponibilidad de las personas responsables. Si no se obtiene ese acceso, el estudio se limitará al corpus documental autorizado, declarará sus faltantes y no inferirá el funcionamiento real de la empresa. No se requiere comprar software especializado </w:t>
       </w:r>
       <w:r>
         <w:lastRenderedPageBreak/>
-        <w:t>cierre. El vacío atendido es la falta de esa articulación en los componentes disponibles del caso, según el problema delimitado; no se sostiene que sea el primer estudio del tema ni que exista una ausencia universal de investigación. La novedad deberá evaluarse frente a la evidencia reunida y a la ampliación bibliográfica regional, que sigue pendiente.</w:t>
-      </w:r>
-    </w:p>
-    <w:p>
-      <w:pPr>
-        <w:pStyle w:val="Ttulo2"/>
-      </w:pPr>
-      <w:bookmarkStart w:id="13" w:name="_Toc242548498"/>
-      <w:r>
-        <w:t>4.5 Viabilidad</w:t>
-      </w:r>
-      <w:bookmarkEnd w:id="13"/>
-    </w:p>
-    <w:p>
-      <w:r>
-        <w:t>La fase documental es realizable con los recursos locales comprobados: los antecedentes de Tareas 8–10, las matrices, las copias de borradores y los textos institucionales conservados. El material docente señala que la justificación debe argumentar tiempo, recursos, acceso, ética y limitaciones, no limitarse a afirmar que el tema es importante (Instituto Tecnológico Superior de Cajeme, s. f.-c). Para el periodo septiembre–noviembre de 2026 se propone utilizar lo ya recopilado en septiembre como línea de bas</w:t>
-      </w:r>
-      <w:r>
-        <w:t>e y distribuir el trabajo restante en revisión de requisitos durante octubre, diagnóstico y contraste documental entre finales de octubre e inicios de noviembre, y priorización y revisión de resultados durante noviembre. Es una programación propuesta, no un registro de tareas ya realizadas.</w:t>
-      </w:r>
-    </w:p>
-    <w:p>
-      <w:r>
-        <w:t xml:space="preserve">La disponibilidad de las copias internas permite revisar su contenido, pero no demuestra autorización para entrevistar actores, acceder a expedientes completos o divulgar datos privados. Cualquier entrevista o incorporación de nuevos documentos quedará condicionada al consentimiento, autorización y disponibilidad de las personas responsables. Si no se obtiene ese acceso, el estudio se limitará al corpus documental autorizado, declarará sus faltantes y no inferirá el funcionamiento real de la empresa. No se </w:t>
-      </w:r>
-      <w:r>
-        <w:t>requiere comprar software especializado para esta fase; se emplearán los procesadores de texto, hojas de cálculo y herramientas de consulta disponibles, sin afirmar un presupuesto aprobado ni compromisos de dedicación ajenos.</w:t>
-      </w:r>
-    </w:p>
-    <w:p>
-      <w:r>
-        <w:t xml:space="preserve">Los controles éticos comprenden minimizar datos personales, separar documentos de ejemplo de hechos confirmados, restringir el acceso a los archivos internos y citar fuentes sin redistribuir información sensible. Las limitaciones controlables son la trazabilidad de cada </w:t>
-      </w:r>
-      <w:r>
-        <w:lastRenderedPageBreak/>
-        <w:t>extracción, el registro de fecha de consulta, la revisión de coherencia y la identificación de afirmaciones no respaldadas. La vigencia normativa y la completitud del expediente son riesgos que deben comprobarse durante la investigación; por ello, la factibilidad es suficiente para iniciar el análisis documental y condicionada para ampliar su alcance. La matriz mantiene preguntas y objetivos, sin una columna adicional de justificación, y el Covey conserva problema y objetivo general como prioridades importa</w:t>
-      </w:r>
-      <w:r>
-        <w:t>ntes y no urgentes, sin nuevos elementos.</w:t>
+        <w:t>para esta fase; se emplearán los procesadores de texto, hojas de cálculo y herramientas de consulta disponibles, sin afirmar un presupuesto aprobado ni compromisos de dedicación ajenos.</w:t>
+      </w:r>
+    </w:p>
+    <w:p>
+      <w:r>
+        <w:t>Los controles éticos comprenden minimizar datos personales, separar documentos de ejemplo de hechos confirmados, restringir el acceso a los archivos internos y citar fuentes sin redistribuir información sensible. Las limitaciones controlables son la trazabilidad de cada extracción, el registro de fecha de consulta, la revisión de coherencia y la identificación de afirmaciones no respaldadas. La vigencia normativa y la completitud del expediente son riesgos que deben comprobarse durante la investigación; por ello, la factibilidad es suficiente para iniciar el análisis documental y condicionada para ampliar su alcance. La matriz mantiene preguntas y objetivos, sin una columna adicional de justificación, y el Covey conserva problema y objetivo general como prioridades importantes y no urgentes, sin nuevos elementos.</w:t>
       </w:r>
     </w:p>
     <w:p>
@@ -2609,7 +2586,7 @@
         <w:pStyle w:val="Ttulo1"/>
         <w:spacing w:before="120" w:after="80"/>
       </w:pPr>
-      <w:bookmarkStart w:id="14" w:name="_Toc242548499"/>
+      <w:bookmarkStart w:id="14" w:name="_Toc242551018"/>
       <w:r>
         <w:t>5 Hipótesis de trabajo</w:t>
       </w:r>
@@ -2620,7 +2597,7 @@
         <w:pStyle w:val="Ttulo1"/>
         <w:spacing w:before="120" w:after="80"/>
       </w:pPr>
-      <w:bookmarkStart w:id="15" w:name="_Toc242548500"/>
+      <w:bookmarkStart w:id="15" w:name="_Toc242551019"/>
       <w:r>
         <w:t>6 Alcances y limitaciones</w:t>
       </w:r>
@@ -2631,7 +2608,7 @@
         <w:pStyle w:val="Ttulo2"/>
         <w:spacing w:before="240" w:after="80"/>
       </w:pPr>
-      <w:bookmarkStart w:id="16" w:name="_Toc242548501"/>
+      <w:bookmarkStart w:id="16" w:name="_Toc242551020"/>
       <w:r>
         <w:t>6.1 Alcances</w:t>
       </w:r>
@@ -2642,7 +2619,7 @@
         <w:pStyle w:val="Ttulo2"/>
         <w:spacing w:before="240" w:after="80"/>
       </w:pPr>
-      <w:bookmarkStart w:id="17" w:name="_Toc242548502"/>
+      <w:bookmarkStart w:id="17" w:name="_Toc242551021"/>
       <w:r>
         <w:t>6.2 Limitaciones</w:t>
       </w:r>
@@ -2653,7 +2630,7 @@
         <w:pStyle w:val="Ttulo1"/>
         <w:spacing w:before="120" w:after="80"/>
       </w:pPr>
-      <w:bookmarkStart w:id="18" w:name="_Toc242548503"/>
+      <w:bookmarkStart w:id="18" w:name="_Toc242551022"/>
       <w:r>
         <w:t>7 Marco teórico</w:t>
       </w:r>
@@ -2664,7 +2641,7 @@
         <w:pStyle w:val="Ttulo1"/>
         <w:spacing w:before="120" w:after="80"/>
       </w:pPr>
-      <w:bookmarkStart w:id="19" w:name="_Toc242548504"/>
+      <w:bookmarkStart w:id="19" w:name="_Toc242551023"/>
       <w:r>
         <w:t>8 Métodos o procedimientos</w:t>
       </w:r>
@@ -2676,7 +2653,7 @@
         <w:keepNext w:val="0"/>
         <w:spacing w:before="120" w:after="80"/>
       </w:pPr>
-      <w:bookmarkStart w:id="20" w:name="_Toc242548505"/>
+      <w:bookmarkStart w:id="20" w:name="_Toc242551024"/>
       <w:r>
         <w:t>9 Cronograma de actividades</w:t>
       </w:r>
@@ -2688,7 +2665,7 @@
         <w:pageBreakBefore/>
         <w:spacing w:before="120" w:after="80"/>
       </w:pPr>
-      <w:bookmarkStart w:id="21" w:name="_Toc242548506"/>
+      <w:bookmarkStart w:id="21" w:name="_Toc242551025"/>
       <w:r>
         <w:lastRenderedPageBreak/>
         <w:t>Referencias</w:t>
@@ -3013,10 +2990,26 @@
     </w:p>
     <w:p>
       <w:pPr>
+        <w:ind w:left="720" w:hanging="720"/>
+      </w:pPr>
+      <w:r>
+        <w:t>Instituto Nacional de Estadística y Geografía. (2024). Censos Económicos 2024. https://www.inegi.org.mx/programas/ce/2024/</w:t>
+      </w:r>
+    </w:p>
+    <w:p>
+      <w:pPr>
+        <w:ind w:left="720" w:hanging="720"/>
+      </w:pPr>
+      <w:r>
+        <w:t>Instituto Nacional de Estadística y Geografía. (2020). Censo de Población y Vivienda 2020. https://www.inegi.org.mx/programas/ccpv/2020/</w:t>
+      </w:r>
+    </w:p>
+    <w:p>
+      <w:pPr>
         <w:pStyle w:val="Ttulo1"/>
         <w:pageBreakBefore/>
       </w:pPr>
-      <w:bookmarkStart w:id="22" w:name="_Toc242548507"/>
+      <w:bookmarkStart w:id="22" w:name="_Toc242551026"/>
       <w:r>
         <w:lastRenderedPageBreak/>
         <w:t>Anexo 1 Matriz de consistencia</w:t>
@@ -3225,7 +3218,7 @@
         <w:pStyle w:val="Ttulo2"/>
         <w:pageBreakBefore/>
       </w:pPr>
-      <w:bookmarkStart w:id="23" w:name="_Toc242548508"/>
+      <w:bookmarkStart w:id="23" w:name="_Toc242551027"/>
       <w:r>
         <w:lastRenderedPageBreak/>
         <w:t>Correspondencia de preguntas y objetivos específicos</w:t>
@@ -3721,7 +3714,7 @@
         <w:pStyle w:val="Ttulo1"/>
         <w:pageBreakBefore/>
       </w:pPr>
-      <w:bookmarkStart w:id="24" w:name="_Toc242548509"/>
+      <w:bookmarkStart w:id="24" w:name="_Toc242551028"/>
       <w:r>
         <w:lastRenderedPageBreak/>
         <w:t>Anexo 2 Círculo de Covey</w:t>

</xml_diff>